<commit_message>
Party Picker 1.0.0: renumber the tested 0.1.6 build for release
Alan: "Please change the version to 1.0.0 and redo the pak and documentation".

- PP.VERSION 1.0.0; meta.lsx Version64 36028797018963968 (both places).
- PartyPicker.pak rebuilt from an LF export: 30,043 bytes, SHA-256
  89005f94feeab56fa4e79969bc2f258de1804a809b4359a587c82f4b07a56e3c.
  Unpacked and diffed against the tested 0.1.6 pak: only those three
  lines differ. Tests: 114 passed.
- Release documents, Nexus BBCode, RUN_CARD, README, CLAUDE.md and
  docs/TESTING.md updated to 1.0.0. Not yet loaded in game.
</commit_message>
<xml_diff>
--- a/dist_docs/INSTALL.docx
+++ b/dist_docs/INSTALL.docx
@@ -208,7 +208,7 @@
           <w:rFonts w:ascii="Consolas" w:hAnsi="Consolas" w:eastAsia="Consolas"/>
           <w:sz w:val="19"/>
         </w:rPr>
-        <w:t>PartyPicker-0.1.6.zip</w:t>
+        <w:t>PartyPicker-1.0.0.zip</w:t>
       </w:r>
       <w:r>
         <w:rPr/>
@@ -464,7 +464,7 @@
           <w:rFonts w:ascii="Consolas" w:hAnsi="Consolas" w:eastAsia="Consolas"/>
           <w:sz w:val="19"/>
         </w:rPr>
-        <w:t>[PartyPicker] client loaded (v0.1.6) (Party tab added to MCM). Client console: !pp</w:t>
+        <w:t>[PartyPicker] client loaded (v1.0.0) (Party tab added to MCM). Client console: !pp</w:t>
       </w:r>
     </w:p>
     <w:p>
@@ -477,7 +477,7 @@
           <w:rFonts w:ascii="Consolas" w:hAnsi="Consolas" w:eastAsia="Consolas"/>
           <w:sz w:val="19"/>
         </w:rPr>
-        <w:t>[PartyPicker] server loaded (v0.1.6). Console (server context): !pp_roster  !pp_set Name1,Name2  !pp_restore  !pp_size  !pp_forget Name</w:t>
+        <w:t>[PartyPicker] server loaded (v1.0.0). Console (server context): !pp_roster  !pp_set Name1,Name2  !pp_restore  !pp_size  !pp_forget Name</w:t>
       </w:r>
     </w:p>
     <w:p>
@@ -589,7 +589,7 @@
           <w:rFonts w:ascii="Consolas" w:hAnsi="Consolas" w:eastAsia="Consolas"/>
           <w:sz w:val="19"/>
         </w:rPr>
-        <w:t>Party Picker v0.1.6 roster:</w:t>
+        <w:t>Party Picker v1.0.0 roster:</w:t>
       </w:r>
       <w:r>
         <w:rPr/>

</xml_diff>

<commit_message>
1.1.0 release build: pak, RUN_CARD, rendered docs, release notes; review fixes
</commit_message>
<xml_diff>
--- a/dist_docs/INSTALL.docx
+++ b/dist_docs/INSTALL.docx
@@ -208,7 +208,7 @@
           <w:rFonts w:ascii="Consolas" w:hAnsi="Consolas" w:eastAsia="Consolas"/>
           <w:sz w:val="19"/>
         </w:rPr>
-        <w:t>PartyPicker-1.0.1.zip</w:t>
+        <w:t>PartyPicker-1.1.0.zip</w:t>
       </w:r>
       <w:r>
         <w:rPr/>
@@ -464,7 +464,7 @@
           <w:rFonts w:ascii="Consolas" w:hAnsi="Consolas" w:eastAsia="Consolas"/>
           <w:sz w:val="19"/>
         </w:rPr>
-        <w:t>[PartyPicker] client loaded (v1.0.1) (Party tab added to MCM). Client console: !pp</w:t>
+        <w:t>[PartyPicker] client loaded (v1.1.0) (Party tab added to MCM). Client console: !pp</w:t>
       </w:r>
     </w:p>
     <w:p>
@@ -477,7 +477,7 @@
           <w:rFonts w:ascii="Consolas" w:hAnsi="Consolas" w:eastAsia="Consolas"/>
           <w:sz w:val="19"/>
         </w:rPr>
-        <w:t>[PartyPicker] server loaded (v1.0.1). Console (server context): !pp_roster  !pp_set Name1,Name2  !pp_restore  !pp_size  !pp_forget Name</w:t>
+        <w:t>[PartyPicker] server loaded (v1.1.0). Console (server context): !pp_roster  !pp_set Name1,Name2  !pp_restore  !pp_size  !pp_forget Name  !pp_halsin</w:t>
       </w:r>
     </w:p>
     <w:p>
@@ -589,7 +589,7 @@
           <w:rFonts w:ascii="Consolas" w:hAnsi="Consolas" w:eastAsia="Consolas"/>
           <w:sz w:val="19"/>
         </w:rPr>
-        <w:t>Party Picker v1.0.1 roster:</w:t>
+        <w:t>Party Picker v1.1.0 roster:</w:t>
       </w:r>
       <w:r>
         <w:rPr/>
@@ -689,7 +689,7 @@
       </w:r>
       <w:r>
         <w:rPr/>
-        <w:t>, 4 to 16, default 6, counting your own character.</w:t>
+        <w:t>, 4 to 30, default 6, counting your own character. It can't be set below the number already in your party.</w:t>
       </w:r>
     </w:p>
     <w:p>
@@ -949,7 +949,7 @@
       </w:r>
       <w:r>
         <w:rPr/>
-        <w:t xml:space="preserve"> is greyed out, more people are ticked than the limit allows, or nobody is ticked.</w:t>
+        <w:t xml:space="preserve"> is greyed out, nobody is ticked, or you are not the host in multiplayer. With more people ticked than the limit allows, Apply changes nothing and a message window says how many to untick.</w:t>
       </w:r>
     </w:p>
     <w:p>
@@ -1065,7 +1065,7 @@
       </w:pPr>
       <w:r>
         <w:rPr/>
-        <w:t>Party Limit Begone and similar mods set the same party limit; whichever applies it last wins. Pick one.</w:t>
+        <w:t>Party Limit Begone and similar mods set the same party limit; whichever applies it last wins. Pick one. If Configurable Party Limit is active, Party Picker writes a warning to the Script Extender log when a save loads.</w:t>
       </w:r>
     </w:p>
     <w:p>
@@ -1088,7 +1088,37 @@
       </w:r>
       <w:r>
         <w:rPr/>
-        <w:t xml:space="preserve"> on the Party tab and save. What happens to a party larger than four once Party Picker is gone has not been tested.</w:t>
+        <w:t xml:space="preserve"> on the Party tab and save. What happens to a party larger than four once Party Picker is gone has not been tested. </w:t>
+      </w:r>
+      <w:r>
+        <w:rPr>
+          <w:b/>
+        </w:rPr>
+        <w:t>If Halsin joined early</w:t>
+      </w:r>
+      <w:r>
+        <w:rPr/>
+        <w:t xml:space="preserve"> (the setting </w:t>
+      </w:r>
+      <w:r>
+        <w:rPr>
+          <w:b/>
+        </w:rPr>
+        <w:t>Let Halsin join early</w:t>
+      </w:r>
+      <w:r>
+        <w:rPr/>
+        <w:t xml:space="preserve">), keep Party Picker until you have pressed </w:t>
+      </w:r>
+      <w:r>
+        <w:rPr>
+          <w:b/>
+        </w:rPr>
+        <w:t>Put Halsin's quest back on track</w:t>
+      </w:r>
+      <w:r>
+        <w:rPr/>
+        <w:t xml:space="preserve"> at Last Light. Without Party Picker that button is gone, and his quest at Last Light won't start by itself.</w:t>
       </w:r>
     </w:p>
     <w:p>
@@ -1133,7 +1163,7 @@
     <w:p>
       <w:r>
         <w:rPr/>
-        <w:t>Party Picker adds no spells or statuses. The only items it adds are the extra Debtor's Attire sets in the House of Hope; they are the game's own outfit, and the game destroys them like its own when the alarm is raised. What stays in your save is Party Picker's own small records (who waited in camp during a rest, and who it has seen join your party) and the extra raft landing rows, which the game only uses when more than four people ride the raft.</w:t>
+        <w:t>Party Picker adds no spells or statuses. The only items it adds are the extra Debtor's Attire sets in the House of Hope; they are the game's own outfit, and the game destroys them like its own when the alarm is raised. What stays in your save is Party Picker's own small records (who waited in camp during a rest, who it has seen join your party, and whether Halsin's quest was put back on track) and the extra raft landing rows, which the game only uses when more than four people ride the raft.</w:t>
       </w:r>
     </w:p>
     <w:p>

</xml_diff>